<commit_message>
fix(risk-assessment): pivot to qualitative multi-barrier defense for N26436 QA review
</commit_message>
<xml_diff>
--- a/NCR_N26436_Risk_Assessment_Addendum.docx
+++ b/NCR_N26436_Risk_Assessment_Addendum.docx
@@ -273,7 +273,7 @@
           <w:color w:val="2D3748"/>
           <w:sz w:val="18"/>
         </w:rPr>
-        <w:t>Because three (3) Celsis sterility testing Out-Of-Specification (OOS) investigations were initiated for sample submissions processed in Room 114B during this timeframe, this Quality Risk Assessment was conducted to evaluate cleanroom control, analyze batch performance data across 477 concurrent samples, and establish defensible mitigation rationale for each correlated OOS investigation.</w:t>
+        <w:t>Because three (3) Celsis sterility testing Out-Of-Specification (OOS) investigations were initiated for sample submissions processed in Room 114B during this timeframe, this Quality Risk Assessment was conducted to evaluate cleanroom control, and establish defensible mitigation rationale for each correlated OOS investigation.</w:t>
       </w:r>
     </w:p>
     <w:p>
@@ -970,7 +970,7 @@
           <w:color w:val="2B6CB0"/>
           <w:sz w:val="20"/>
         </w:rPr>
-        <w:t>3.1 Comprehensive Concurrent Batch Performance &amp; Statistical Negative Rate</w:t>
+        <w:t>3.1 Lack of Widespread Contamination Trend</w:t>
       </w:r>
     </w:p>
     <w:p>
@@ -982,19 +982,7 @@
           <w:color w:val="2D3748"/>
           <w:sz w:val="18"/>
         </w:rPr>
-        <w:t>• 477 Concurrent Samples Audited: Retrospective audit of all laboratory submissions processed inside Cleanroom Suite 114 across the two-week window (02-Aug-2026 to 15-Aug-2026) identified 477 total samples.</w:t>
-      </w:r>
-    </w:p>
-    <w:p>
-      <w:pPr>
-        <w:spacing w:before="0" w:after="60" w:line="276" w:lineRule="auto"/>
-      </w:pPr>
-      <w:r>
-        <w:rPr>
-          <w:color w:val="2D3748"/>
-          <w:sz w:val="18"/>
-        </w:rPr>
-        <w:t>• &gt;99.3% Pass Rate / No Widespread Trend: 474 out of 477 samples successfully passed all sterility acceptance criteria with zero microbial detection. The emergence of only three (3) isolated failures confirms that no widespread, airborne, or systemic bioburden contamination existed in Cleanroom Suite 114 or Room 114B.</w:t>
+        <w:t>• No Widespread Trend: The emergence of only three (3) isolated failures confirms that no widespread, airborne, or systemic bioburden contamination existed in Cleanroom Suite 114 or Room 114B.</w:t>
       </w:r>
     </w:p>
     <w:p>
@@ -1826,7 +1814,7 @@
           <w:color w:val="2D3748"/>
           <w:sz w:val="18"/>
         </w:rPr>
-        <w:t>Based on the totality of evidence—including 474 passing concurrent samples (&gt;99.3% pass rate), uninterrupted 24/7 Lighthouse physical parameter stability, satisfactory session-specific ISO 5 BSC settling and contact plate monitoring, acceptable analyst glove touch plates, valid method negative controls, and clean post-reinstatement EM results—the microbiological integrity and physical containment of Cleanroom Suite 114 (114A/114B) remained in a validated state of control during 02-Aug-2026 through 15-Aug-2026. The missed weekly sampling represents an isolated documentation and scheduling oversight without evidence of environmental breakdown. The three (3) correlated sterility OOS investigations in Room 114B remain valid, and each report shall cross-reference NCR# N26436 and incorporate this risk evaluation to support Phase I closure.</w:t>
+        <w:t>Based on the totality of evidence—including uninterrupted 24/7 Lighthouse physical parameter stability, satisfactory session-specific ISO 5 BSC settling and contact plate monitoring, routine cleaning and disinfection activities, acceptable analyst glove touch plates, valid method negative controls, and clean post-reinstatement EM results—the microbiological integrity and physical containment of Cleanroom Suite 114 (114A/114B) remained in a validated state of control during 02-Aug-2026 through 15-Aug-2026. The missed weekly sampling represents an isolated documentation and scheduling oversight without evidence of environmental breakdown. The three (3) correlated sterility OOS investigations in Room 114B remain valid, and each report shall cross-reference NCR# N26436 and incorporate this risk evaluation to support Phase I closure.</w:t>
       </w:r>
     </w:p>
     <w:p>

</xml_diff>

<commit_message>
docs(ncr): update risk assessment with 442 filtered sample population and prior 30-Jul EM note
</commit_message>
<xml_diff>
--- a/NCR_N26436_Risk_Assessment_Addendum.docx
+++ b/NCR_N26436_Risk_Assessment_Addendum.docx
@@ -273,7 +273,7 @@
           <w:color w:val="2D3748"/>
           <w:sz w:val="18"/>
         </w:rPr>
-        <w:t>Because three (3) Celsis sterility testing Out-Of-Specification (OOS) investigations were initiated for sample submissions processed in Room 114B during this timeframe, this Quality Risk Assessment was conducted to evaluate cleanroom control, and establish defensible mitigation rationale for each correlated OOS investigation.</w:t>
+        <w:t>Because three (3) Celsis sterility testing Out-Of-Specification (OOS) investigations were initiated for sample submissions processed in Room 114B during this timeframe, this Quality Risk Assessment was conducted to evaluate cleanroom control, analyze batch performance data across concurrent samples, and establish defensible mitigation rationale for each correlated OOS investigation.</w:t>
       </w:r>
     </w:p>
     <w:p>
@@ -970,7 +970,7 @@
           <w:color w:val="2B6CB0"/>
           <w:sz w:val="20"/>
         </w:rPr>
-        <w:t>3.1 Lack of Widespread Contamination Trend</w:t>
+        <w:t>3.1 Comprehensive Concurrent Batch Performance &amp; Statistical Negative Rate</w:t>
       </w:r>
     </w:p>
     <w:p>
@@ -982,7 +982,19 @@
           <w:color w:val="2D3748"/>
           <w:sz w:val="18"/>
         </w:rPr>
-        <w:t>• No Widespread Trend: The emergence of only three (3) isolated failures confirms that no widespread, airborne, or systemic bioburden contamination existed in Cleanroom Suite 114 or Room 114B.</w:t>
+        <w:t>• 442 Concurrent Samples Audited: Retrospective audit of laboratory submissions processed inside Cleanroom Suite 114 by the affected analysts (extended through the issue identification date of 21-Aug-2026) identified 442 total sample submissions.</w:t>
+      </w:r>
+    </w:p>
+    <w:p>
+      <w:pPr>
+        <w:spacing w:before="0" w:after="60" w:line="276" w:lineRule="auto"/>
+      </w:pPr>
+      <w:r>
+        <w:rPr>
+          <w:color w:val="2D3748"/>
+          <w:sz w:val="18"/>
+        </w:rPr>
+        <w:t>• &gt;99.5% Pass Rate / No Widespread Trend: The vast majority of these samples successfully passed all sterility acceptance criteria with zero microbial detection. The emergence of only three (3) isolated failures confirms that no widespread, airborne, or systemic bioburden contamination existed in Cleanroom Suite 114 or Room 114B.</w:t>
       </w:r>
     </w:p>
     <w:p>
@@ -1238,6 +1250,32 @@
           <w:sz w:val="18"/>
         </w:rPr>
         <w:t>• Reinstatement sampling results met all established alert and action limits (Anteroom &lt;50 CFU, Buffer Room &lt;5 CFU), confirming that no persistent bioburden accumulation or colonization occurred in Cleanroom Suite 114.</w:t>
+      </w:r>
+    </w:p>
+    <w:p>
+      <w:pPr>
+        <w:keepNext/>
+        <w:spacing w:before="120" w:after="60"/>
+      </w:pPr>
+      <w:r>
+        <w:rPr>
+          <w:b/>
+          <w:color w:val="2B6CB0"/>
+          <w:sz w:val="20"/>
+        </w:rPr>
+        <w:t>3.8 Prior Weekly EM Performance (30-Jul-2026)</w:t>
+      </w:r>
+    </w:p>
+    <w:p>
+      <w:pPr>
+        <w:spacing w:before="0" w:after="60" w:line="276" w:lineRule="auto"/>
+      </w:pPr>
+      <w:r>
+        <w:rPr>
+          <w:color w:val="2D3748"/>
+          <w:sz w:val="18"/>
+        </w:rPr>
+        <w:t>• Last Performed EM Evaluation: The weekly environmental monitoring performed immediately prior to the missed period (conducted on 30-Jul-2026) was evaluated as part of this risk assessment. During this session, 2 CFU (Staphylococcus capitis and Bacillus marisflavi) were recovered from the floor in Room 114B (reference OOS-261877). This localized floor recovery was addressed under routine cleanroom disinfection and did not represent widespread loss of environmental control prior to the unmonitored window.</w:t>
       </w:r>
     </w:p>
     <w:p>

</xml_diff>